<commit_message>
Expand references to 15 and add journal-style volume/page details
- Add page numbers, volumes, and article numbers to existing citations
- Fix SPANR title to include the RNA splicing prefix
- Add eight verified references (disease-splicing background, ACMG/AMP
  interpretation guidelines, prior splice-predictor benchmark, multiplexed
  assays, MMSplice, precision-recall rationale), each cited where it
  supports the text; references ordered by appearance
</commit_message>
<xml_diff>
--- a/docs/SpliceConsensus_Report.docx
+++ b/docs/SpliceConsensus_Report.docx
@@ -63,17 +63,17 @@
     </w:p>
     <w:p>
       <w:r>
-        <w:t>RNA splicing is disrupted in a large share of disease-causing variants, and splice-altering variants are among the hardest to interpret in clinical genetics, because their effect depends on sequence context that is not obvious from the variant alone (Scotti and Swanson 2016). Deep-learning predictors of splicing from primary sequence, notably SpliceAI (Jaganathan et al. 2019) and Pangolin (Zeng and Li 2022), are now widely used to flag candidate splice-disrupting variants and appear in clinical interpretation pipelines.</w:t>
+        <w:t>RNA splicing is disrupted in a large share of disease-causing variants, and splice-altering variants are among the hardest to interpret in clinical genetics, because their effect depends on sequence context that is not obvious from the variant alone (Scotti and Swanson 2016; Wang and Cooper 2007; Cartegni et al. 2002). Deep-learning predictors of splicing from primary sequence, notably SpliceAI (Jaganathan et al. 2019) and Pangolin (Zeng and Li 2022), are now widely used to flag candidate splice-disrupting variants and appear in clinical variant-interpretation pipelines (Richards et al. 2015; Walker et al. 2023).</w:t>
       </w:r>
     </w:p>
     <w:p>
       <w:r>
-        <w:t>These predictors, together with the more recent SpliceTransformer (You et al. 2024) and the earlier SPANR model (Xiong et al. 2015), are usually evaluated in their own publications on heterogeneous datasets and metrics, which makes it hard to compare them on equal footing or to know where each is reliable. Multiplexed experimental assays provide a fixed ground truth for such comparisons: MFASS (Chong et al. 2019) measured the splicing effect of tens of thousands of human single-nucleotide variants in exons and flanking intronic regions in a minigene reporter and labels those that strongly reduce exon inclusion as splice-disrupting variants.</w:t>
+        <w:t>These predictors, together with the more recent SpliceTransformer (You et al. 2024), the earlier SPANR model (Xiong et al. 2015), and other models such as MMSplice (Cheng et al. 2019), are usually evaluated in their own publications on heterogeneous datasets and metrics, which makes it hard to compare them on equal footing or to know where each is reliable. Multiplexed experimental assays of splicing provide a fixed ground truth for such comparisons (Rosenberg et al. 2015): MFASS (Chong et al. 2019) measured the splicing effect of tens of thousands of human single-nucleotide variants in exons and flanking intronic regions in a minigene reporter and labels those that strongly reduce exon inclusion as splice-disrupting variants.</w:t>
       </w:r>
     </w:p>
     <w:p>
       <w:r>
-        <w:t>Here we provide a uniform, reproducible, open benchmark of all four predictors on the MFASS single-nucleotide variants, scored through a single interface, with bootstrap confidence intervals, a held-out consensus, and a legacy baseline. Beyond the aggregate ranking, we ask where the predictions fail: we stratify detection by distance to the splice site and identify the variants that every tool misses. The contribution is the reproducible benchmark and a characterization of a shared exon-interior blind spot.</w:t>
+        <w:t>Prior work has benchmarked deep-learning splice predictors against functional splicing assays (Riepe et al. 2021). Here we provide a uniform, reproducible, open benchmark of all four predictors on the MFASS single-nucleotide variants, scored through a single interface, with bootstrap confidence intervals, an exon-grouped held-out consensus, and a legacy baseline. Beyond the aggregate ranking, we ask where the predictions fail: we stratify detection by distance to the splice site and identify the variants that every tool misses. The contribution is the reproducible benchmark and a characterization of a shared exon-interior blind spot.</w:t>
       </w:r>
     </w:p>
     <w:p>
@@ -89,7 +89,7 @@
     </w:p>
     <w:p>
       <w:r>
-        <w:t>MFASS (the Multiplexed Functional Assay of Splicing by Sort-seq; Chong et al. 2019) measured the splicing effect of human single-nucleotide variants in exons and flanking intronic regions in a minigene reporter. Each variant carries a measured change in exon inclusion, and variants reducing inclusion by at least 0.50 are labeled splice-disrupting variants (SDVs). We score the 28,972 mutant SNVs (51% in exons, 49% in the flanking introns within about 50 bp of a splice site); for the binary detection task we drop variants whose inclusion change was not measured, leaving 27,733 variants of which 1,050 (3.79%) are SDVs. The strong imbalance makes average precision the primary metric, reported alongside AUROC.</w:t>
+        <w:t>MFASS (the Multiplexed Functional Assay of Splicing by Sort-seq; Chong et al. 2019) measured the splicing effect of human single-nucleotide variants in exons and flanking intronic regions in a minigene reporter. Each variant carries a measured change in exon inclusion, and variants reducing inclusion by at least 0.50 are labeled splice-disrupting variants (SDVs). We score the 28,972 mutant SNVs (51% in exons, 49% in the flanking introns within about 50 bp of a splice site); for the binary detection task we drop variants whose inclusion change was not measured, leaving 27,733 variants of which 1,050 (3.79%) are SDVs. The strong imbalance makes average precision the primary metric (Saito and Rehmsmeier 2015), reported alongside AUROC.</w:t>
       </w:r>
     </w:p>
     <w:p>
@@ -516,7 +516,7 @@
     </w:p>
     <w:p>
       <w:r>
-        <w:t>Most strikingly, 22% of all disrupting variants (228 of 1,050) are missed by every one of the four tools at this operating point. These shared misses sit predominantly away from the splice site: 75% lie more than 10 bp from a splice site, and 162 of 228 (71%) are exonic. They are consistent with exon-interior regulatory disruptions, including possible exonic splicing enhancer or silencer effects, that splice-site models are not built to capture, the class of variant MFASS was designed to expose. The practical implication is that these tools are strongest for splice-site-proximal variants but require caution for exon-interior variants, where roughly one in five disrupting variants is invisible to all current predictors.</w:t>
+        <w:t>Most strikingly, 22% of all disrupting variants (228 of 1,050) are missed by every one of the four tools at this operating point. These shared misses sit predominantly away from the splice site: 75% lie more than 10 bp from a splice site, and 162 of 228 (71%) are exonic. They are consistent with exon-interior regulatory disruptions, including possible exonic splicing enhancer or silencer effects (Cartegni et al. 2002), that splice-site models are not built to capture, the class of variant MFASS was designed to expose. The practical implication is that these tools are strongest for splice-site-proximal variants but require caution for exon-interior variants, where roughly one in five disrupting variants is invisible to all current predictors.</w:t>
       </w:r>
     </w:p>
     <w:p>
@@ -564,7 +564,7 @@
     </w:p>
     <w:p>
       <w:r>
-        <w:t>All code, the per-tool variant scores, the benchmark and failure-mode outputs, and the figures are openly available at github.com/brhanufen/spliceconsensus and and archived on Zenodo (doi:10.5281/zenodo.20948820). The benchmark and all figures reproduce on a CPU in about a minute from the committed scores and a slim labels file, with no large download. The MFASS dataset is from Chong et al. 2019 (github.com/KosuriLab/MFASS); the predictors are the public SpliceAI, Pangolin, SpliceTransformer, and SPANR models, run through the Proto tool ecosystem.</w:t>
+        <w:t>All code, the per-tool variant scores, the benchmark and failure-mode outputs, and the figures are openly available at github.com/brhanufen/spliceconsensus and archived on Zenodo (doi:10.5281/zenodo.20948820). The benchmark and all figures reproduce on a CPU in about a minute from the committed scores and a slim labels file, with no large download. The MFASS dataset is from Chong et al. 2019 (github.com/KosuriLab/MFASS); the predictors are the public SpliceAI, Pangolin, SpliceTransformer, and SPANR models, run through the Proto tool ecosystem.</w:t>
       </w:r>
     </w:p>
     <w:p>
@@ -599,7 +599,7 @@
         <w:pStyle w:val="ListBullet"/>
       </w:pPr>
       <w:r>
-        <w:t>Scotti, M.M. and Swanson, M.S. RNA mis-splicing in disease. Nature Reviews Genetics 17, 2016. doi:10.1038/nrg.2015.3.</w:t>
+        <w:t>Scotti, M.M. and Swanson, M.S. RNA mis-splicing in disease. Nature Reviews Genetics 17(1):19–32, 2016. doi:10.1038/nrg.2015.3.</w:t>
       </w:r>
     </w:p>
     <w:p>
@@ -607,7 +607,7 @@
         <w:pStyle w:val="ListBullet"/>
       </w:pPr>
       <w:r>
-        <w:t>Zeng, T. and Li, Y.I. Predicting RNA splicing from DNA sequence using Pangolin. Genome Biology, 2022. doi:10.1186/s13059-022-02664-4.</w:t>
+        <w:t>Wang, G.-S. and Cooper, T.A. Splicing in disease: disruption of the splicing code and the decoding machinery. Nature Reviews Genetics 8:749–761, 2007. doi:10.1038/nrg2164.</w:t>
       </w:r>
     </w:p>
     <w:p>
@@ -615,7 +615,39 @@
         <w:pStyle w:val="ListBullet"/>
       </w:pPr>
       <w:r>
-        <w:t>Jaganathan, K., et al. Predicting splicing from primary sequence with deep learning (SpliceAI). Cell, 2019. doi:10.1016/j.cell.2018.12.015.</w:t>
+        <w:t>Cartegni, L., Chew, S.L., and Krainer, A.R. Listening to silence and understanding nonsense: exonic mutations that affect splicing. Nature Reviews Genetics 3:285–298, 2002. doi:10.1038/nrg775.</w:t>
+      </w:r>
+    </w:p>
+    <w:p>
+      <w:pPr>
+        <w:pStyle w:val="ListBullet"/>
+      </w:pPr>
+      <w:r>
+        <w:t>Jaganathan, K., et al. Predicting splicing from primary sequence with deep learning (SpliceAI). Cell 176(3):535–548.e24, 2019. doi:10.1016/j.cell.2018.12.015.</w:t>
+      </w:r>
+    </w:p>
+    <w:p>
+      <w:pPr>
+        <w:pStyle w:val="ListBullet"/>
+      </w:pPr>
+      <w:r>
+        <w:t>Zeng, T. and Li, Y.I. Predicting RNA splicing from DNA sequence using Pangolin. Genome Biology 23:103, 2022. doi:10.1186/s13059-022-02664-4.</w:t>
+      </w:r>
+    </w:p>
+    <w:p>
+      <w:pPr>
+        <w:pStyle w:val="ListBullet"/>
+      </w:pPr>
+      <w:r>
+        <w:t>Richards, S., Aziz, N., Bale, S., et al. Standards and guidelines for the interpretation of sequence variants: a joint consensus recommendation of the American College of Medical Genetics and Genomics and the Association for Molecular Pathology. Genetics in Medicine 17:405–424, 2015. doi:10.1038/gim.2015.30.</w:t>
+      </w:r>
+    </w:p>
+    <w:p>
+      <w:pPr>
+        <w:pStyle w:val="ListBullet"/>
+      </w:pPr>
+      <w:r>
+        <w:t>Walker, L.C., de la Hoya, M., Wiggins, G.A.R., et al. Using the ACMG/AMP framework to capture evidence related to predicted and observed impact on splicing. The American Journal of Human Genetics 110:1046–1067, 2023. doi:10.1016/j.ajhg.2023.06.002.</w:t>
       </w:r>
     </w:p>
     <w:p>
@@ -631,7 +663,7 @@
         <w:pStyle w:val="ListBullet"/>
       </w:pPr>
       <w:r>
-        <w:t>Chong, R., Insigne, K.D., Yao, D., Burghard, C.P., Wang, J., Hsiao, Y.-H.E., Jones, E.M., Goodman, D.B., Xiao, X., and Kosuri, S. A multiplexed assay for exon recognition reveals that an unappreciated fraction of rare genetic variants cause large-effect splicing disruptions (MFASS). Molecular Cell 73, 183-194.e8, 2019. doi:10.1016/j.molcel.2018.10.037.</w:t>
+        <w:t>Xiong, H.Y., et al. RNA splicing. The human splicing code reveals new insights into the genetic determinants of disease (SPANR). Science 347(6218):1254806, 2015. doi:10.1126/science.1254806.</w:t>
       </w:r>
     </w:p>
     <w:p>
@@ -639,7 +671,31 @@
         <w:pStyle w:val="ListBullet"/>
       </w:pPr>
       <w:r>
-        <w:t>Xiong, H.Y., et al. The human splicing code reveals new insights into the genetic determinants of disease (SPANR). Science 347, 2015. doi:10.1126/science.1254806.</w:t>
+        <w:t>Cheng, J., Nguyen, T.Y.D., Cygan, K.J., et al. MMSplice: modular modeling improves the predictions of genetic variant effects on splicing. Genome Biology 20:48, 2019. doi:10.1186/s13059-019-1653-z.</w:t>
+      </w:r>
+    </w:p>
+    <w:p>
+      <w:pPr>
+        <w:pStyle w:val="ListBullet"/>
+      </w:pPr>
+      <w:r>
+        <w:t>Rosenberg, A.B., Patwardhan, R.P., Shendure, J., and Seelig, G. Learning the sequence determinants of alternative splicing from millions of random sequences. Cell 163:698–711, 2015. doi:10.1016/j.cell.2015.09.054.</w:t>
+      </w:r>
+    </w:p>
+    <w:p>
+      <w:pPr>
+        <w:pStyle w:val="ListBullet"/>
+      </w:pPr>
+      <w:r>
+        <w:t>Chong, R., Insigne, K.D., Yao, D., Burghard, C.P., Wang, J., Hsiao, Y.-H.E., Jones, E.M., Goodman, D.B., Xiao, X., and Kosuri, S. A multiplexed assay for exon recognition reveals that an unappreciated fraction of rare genetic variants cause large-effect splicing disruptions (MFASS). Molecular Cell 73:183–194.e8, 2019. doi:10.1016/j.molcel.2018.10.037.</w:t>
+      </w:r>
+    </w:p>
+    <w:p>
+      <w:pPr>
+        <w:pStyle w:val="ListBullet"/>
+      </w:pPr>
+      <w:r>
+        <w:t>Riepe, T.V., et al. Benchmarking deep learning splice prediction tools using functional splice assays. Human Mutation 42:799–810, 2021. doi:10.1002/humu.24212.</w:t>
       </w:r>
     </w:p>
     <w:p>
@@ -648,6 +704,14 @@
       </w:pPr>
       <w:r>
         <w:t>Merchant, A.T., et al. A high-level programming language for generative biology with Proto. bioRxiv 2026.06.22.733870, 2026. doi:10.64898/2026.06.22.733870.</w:t>
+      </w:r>
+    </w:p>
+    <w:p>
+      <w:pPr>
+        <w:pStyle w:val="ListBullet"/>
+      </w:pPr>
+      <w:r>
+        <w:t>Saito, T. and Rehmsmeier, M. The precision-recall plot is more informative than the ROC plot when evaluating binary classifiers on imbalanced datasets. PLOS ONE 10:e0118432, 2015. doi:10.1371/journal.pone.0118432.</w:t>
       </w:r>
     </w:p>
     <w:sectPr>

</xml_diff>